<commit_message>
Teacher's Guide: add working screenshots of every lab
Each lab section now opens with a captioned screenshot captured
mid-activity (training builds, running cue stacks, lit portraits,
systems under test), plus a full-page hub shot in the overview.
Also corrects the Portrait Lighting preset list to all eight patterns.

Co-Authored-By: Claude Fable 5 <noreply@anthropic.com>
</commit_message>
<xml_diff>
--- a/SDSCPA-Virtual-Labs-Teacher-Guide.docx
+++ b/SDSCPA-Virtual-Labs-Teacher-Guide.docx
@@ -193,7 +193,69 @@
           <w:sz w:val="21"/>
           <w:szCs w:val="21"/>
         </w:rPr>
-        <w:t xml:space="preserve">. Students pick a lab from the hub; every lab links back with the ‹ Labs button in its top-left corner. Each lab card states a one-sentence learning goal in student language (“I can …”) — those goals are quoted throughout this guide and make ready-made objectives for your whiteboard.</w:t>
+        <w:t xml:space="preserve">. Students pick a lab from the hub; every lab links back with the ‹ Labs button in its top-left corner. Each lab card states a one-sentence learning goal in student language (“I can …”) — those goals are quoted throughout this guide and make ready-made objectives for your whiteboard. The screenshots throughout this guide show the labs exactly as students see them.</w:t>
+      </w:r>
+    </w:p>
+    <w:p>
+      <w:pPr>
+        <w:spacing w:after="40" w:before="120"/>
+        <w:jc w:val="center"/>
+      </w:pPr>
+      <w:r>
+        <w:drawing>
+          <wp:inline distT="0" distB="0" distL="0" distR="0">
+            <wp:extent cx="3810000" cy="6286500"/>
+            <wp:effectExtent t="0" r="0" b="0" l="0"/>
+            <wp:docPr id="1" name="" descr="" title=""/>
+            <wp:cNvGraphicFramePr>
+              <a:graphicFrameLocks xmlns:a="http://schemas.openxmlformats.org/drawingml/2006/main" noChangeAspect="1"/>
+            </wp:cNvGraphicFramePr>
+            <a:graphic xmlns:a="http://schemas.openxmlformats.org/drawingml/2006/main">
+              <a:graphicData uri="http://schemas.openxmlformats.org/drawingml/2006/picture">
+                <pic:pic xmlns:pic="http://schemas.openxmlformats.org/drawingml/2006/picture">
+                  <pic:nvPicPr>
+                    <pic:cNvPr id="0" name="" descr=""/>
+                    <pic:cNvPicPr>
+                      <a:picLocks noChangeAspect="1" noChangeArrowheads="1"/>
+                    </pic:cNvPicPr>
+                  </pic:nvPicPr>
+                  <pic:blipFill>
+                    <a:blip r:embed="rId8" cstate="none"/>
+                    <a:srcRect/>
+                    <a:stretch>
+                      <a:fillRect/>
+                    </a:stretch>
+                  </pic:blipFill>
+                  <pic:spPr bwMode="auto">
+                    <a:xfrm>
+                      <a:off x="0" y="0"/>
+                      <a:ext cx="3810000" cy="6286500"/>
+                    </a:xfrm>
+                    <a:prstGeom prst="rect">
+                      <a:avLst/>
+                    </a:prstGeom>
+                  </pic:spPr>
+                </pic:pic>
+              </a:graphicData>
+            </a:graphic>
+          </wp:inline>
+        </w:drawing>
+      </w:r>
+    </w:p>
+    <w:p>
+      <w:pPr>
+        <w:spacing w:after="160"/>
+        <w:jc w:val="center"/>
+      </w:pPr>
+      <w:r>
+        <w:rPr>
+          <w:i/>
+          <w:iCs/>
+          <w:color w:val="6B7280"/>
+          <w:sz w:val="17"/>
+          <w:szCs w:val="17"/>
+        </w:rPr>
+        <w:t xml:space="preserve">The hub: ten labs across Costumes, Lighting, Scenic, and Sound. Every card states the lab’s learning goal; completed labs earn a ✓ chip and feed the printable progress strip.</w:t>
       </w:r>
     </w:p>
     <w:p>
@@ -1664,6 +1726,68 @@
     </w:p>
     <w:p>
       <w:pPr>
+        <w:spacing w:after="40" w:before="120"/>
+        <w:jc w:val="center"/>
+      </w:pPr>
+      <w:r>
+        <w:drawing>
+          <wp:inline distT="0" distB="0" distL="0" distR="0">
+            <wp:extent cx="5905500" cy="3609975"/>
+            <wp:effectExtent t="0" r="0" b="0" l="0"/>
+            <wp:docPr id="1" name="" descr="" title=""/>
+            <wp:cNvGraphicFramePr>
+              <a:graphicFrameLocks xmlns:a="http://schemas.openxmlformats.org/drawingml/2006/main" noChangeAspect="1"/>
+            </wp:cNvGraphicFramePr>
+            <a:graphic xmlns:a="http://schemas.openxmlformats.org/drawingml/2006/main">
+              <a:graphicData uri="http://schemas.openxmlformats.org/drawingml/2006/picture">
+                <pic:pic xmlns:pic="http://schemas.openxmlformats.org/drawingml/2006/picture">
+                  <pic:nvPicPr>
+                    <pic:cNvPr id="0" name="" descr=""/>
+                    <pic:cNvPicPr>
+                      <a:picLocks noChangeAspect="1" noChangeArrowheads="1"/>
+                    </pic:cNvPicPr>
+                  </pic:nvPicPr>
+                  <pic:blipFill>
+                    <a:blip r:embed="rId9" cstate="none"/>
+                    <a:srcRect/>
+                    <a:stretch>
+                      <a:fillRect/>
+                    </a:stretch>
+                  </pic:blipFill>
+                  <pic:spPr bwMode="auto">
+                    <a:xfrm>
+                      <a:off x="0" y="0"/>
+                      <a:ext cx="5905500" cy="3609975"/>
+                    </a:xfrm>
+                    <a:prstGeom prst="rect">
+                      <a:avLst/>
+                    </a:prstGeom>
+                  </pic:spPr>
+                </pic:pic>
+              </a:graphicData>
+            </a:graphic>
+          </wp:inline>
+        </w:drawing>
+      </w:r>
+    </w:p>
+    <w:p>
+      <w:pPr>
+        <w:spacing w:after="160"/>
+        <w:jc w:val="center"/>
+      </w:pPr>
+      <w:r>
+        <w:rPr>
+          <w:i/>
+          <w:iCs/>
+          <w:color w:val="6B7280"/>
+          <w:sz w:val="17"/>
+          <w:szCs w:val="17"/>
+        </w:rPr>
+        <w:t xml:space="preserve">Training mode mid-build: step 5 of a Broadway flat explains the cross bracing while the stock-materials palette waits at right and the cut list writes itself.</w:t>
+      </w:r>
+    </w:p>
+    <w:p>
+      <w:pPr>
         <w:spacing w:after="60" w:before="160"/>
       </w:pPr>
       <w:r>
@@ -2064,6 +2188,68 @@
     </w:p>
     <w:p>
       <w:pPr>
+        <w:spacing w:after="40" w:before="120"/>
+        <w:jc w:val="center"/>
+      </w:pPr>
+      <w:r>
+        <w:drawing>
+          <wp:inline distT="0" distB="0" distL="0" distR="0">
+            <wp:extent cx="5905500" cy="3609975"/>
+            <wp:effectExtent t="0" r="0" b="0" l="0"/>
+            <wp:docPr id="1" name="" descr="" title=""/>
+            <wp:cNvGraphicFramePr>
+              <a:graphicFrameLocks xmlns:a="http://schemas.openxmlformats.org/drawingml/2006/main" noChangeAspect="1"/>
+            </wp:cNvGraphicFramePr>
+            <a:graphic xmlns:a="http://schemas.openxmlformats.org/drawingml/2006/main">
+              <a:graphicData uri="http://schemas.openxmlformats.org/drawingml/2006/picture">
+                <pic:pic xmlns:pic="http://schemas.openxmlformats.org/drawingml/2006/picture">
+                  <pic:nvPicPr>
+                    <pic:cNvPr id="0" name="" descr=""/>
+                    <pic:cNvPicPr>
+                      <a:picLocks noChangeAspect="1" noChangeArrowheads="1"/>
+                    </pic:cNvPicPr>
+                  </pic:nvPicPr>
+                  <pic:blipFill>
+                    <a:blip r:embed="rId10" cstate="none"/>
+                    <a:srcRect/>
+                    <a:stretch>
+                      <a:fillRect/>
+                    </a:stretch>
+                  </pic:blipFill>
+                  <pic:spPr bwMode="auto">
+                    <a:xfrm>
+                      <a:off x="0" y="0"/>
+                      <a:ext cx="5905500" cy="3609975"/>
+                    </a:xfrm>
+                    <a:prstGeom prst="rect">
+                      <a:avLst/>
+                    </a:prstGeom>
+                  </pic:spPr>
+                </pic:pic>
+              </a:graphicData>
+            </a:graphic>
+          </wp:inline>
+        </w:drawing>
+      </w:r>
+    </w:p>
+    <w:p>
+      <w:pPr>
+        <w:spacing w:after="160"/>
+        <w:jc w:val="center"/>
+      </w:pPr>
+      <w:r>
+        <w:rPr>
+          <w:i/>
+          <w:iCs/>
+          <w:color w:val="6B7280"/>
+          <w:sz w:val="17"/>
+          <w:szCs w:val="17"/>
+        </w:rPr>
+        <w:t xml:space="preserve">Audience view above, ground plan below: flats, furniture, actors, and a backdrop arranged on labeled stage areas, with the composition challenges at right.</w:t>
+      </w:r>
+    </w:p>
+    <w:p>
+      <w:pPr>
         <w:spacing w:after="60" w:before="160"/>
       </w:pPr>
       <w:r>
@@ -2388,6 +2574,68 @@
     </w:p>
     <w:p>
       <w:pPr>
+        <w:spacing w:after="40" w:before="120"/>
+        <w:jc w:val="center"/>
+      </w:pPr>
+      <w:r>
+        <w:drawing>
+          <wp:inline distT="0" distB="0" distL="0" distR="0">
+            <wp:extent cx="5905500" cy="3609975"/>
+            <wp:effectExtent t="0" r="0" b="0" l="0"/>
+            <wp:docPr id="1" name="" descr="" title=""/>
+            <wp:cNvGraphicFramePr>
+              <a:graphicFrameLocks xmlns:a="http://schemas.openxmlformats.org/drawingml/2006/main" noChangeAspect="1"/>
+            </wp:cNvGraphicFramePr>
+            <a:graphic xmlns:a="http://schemas.openxmlformats.org/drawingml/2006/main">
+              <a:graphicData uri="http://schemas.openxmlformats.org/drawingml/2006/picture">
+                <pic:pic xmlns:pic="http://schemas.openxmlformats.org/drawingml/2006/picture">
+                  <pic:nvPicPr>
+                    <pic:cNvPr id="0" name="" descr=""/>
+                    <pic:cNvPicPr>
+                      <a:picLocks noChangeAspect="1" noChangeArrowheads="1"/>
+                    </pic:cNvPicPr>
+                  </pic:nvPicPr>
+                  <pic:blipFill>
+                    <a:blip r:embed="rId11" cstate="none"/>
+                    <a:srcRect/>
+                    <a:stretch>
+                      <a:fillRect/>
+                    </a:stretch>
+                  </pic:blipFill>
+                  <pic:spPr bwMode="auto">
+                    <a:xfrm>
+                      <a:off x="0" y="0"/>
+                      <a:ext cx="5905500" cy="3609975"/>
+                    </a:xfrm>
+                    <a:prstGeom prst="rect">
+                      <a:avLst/>
+                    </a:prstGeom>
+                  </pic:spPr>
+                </pic:pic>
+              </a:graphicData>
+            </a:graphic>
+          </wp:inline>
+        </w:drawing>
+      </w:r>
+    </w:p>
+    <w:p>
+      <w:pPr>
+        <w:spacing w:after="160"/>
+        <w:jc w:val="center"/>
+      </w:pPr>
+      <w:r>
+        <w:rPr>
+          <w:i/>
+          <w:iCs/>
+          <w:color w:val="6B7280"/>
+          <w:sz w:val="17"/>
+          <w:szCs w:val="17"/>
+        </w:rPr>
+        <w:t xml:space="preserve">A dimensioned rectangle and a selected circle on the 11″ × 17″ sheet — Object Info shows the circle’s radius as an editable dimension, and the challenge list waits at right.</w:t>
+      </w:r>
+    </w:p>
+    <w:p>
+      <w:pPr>
         <w:spacing w:after="60" w:before="160"/>
       </w:pPr>
       <w:r>
@@ -2634,6 +2882,68 @@
     </w:p>
     <w:p>
       <w:pPr>
+        <w:spacing w:after="40" w:before="120"/>
+        <w:jc w:val="center"/>
+      </w:pPr>
+      <w:r>
+        <w:drawing>
+          <wp:inline distT="0" distB="0" distL="0" distR="0">
+            <wp:extent cx="5905500" cy="3609975"/>
+            <wp:effectExtent t="0" r="0" b="0" l="0"/>
+            <wp:docPr id="1" name="" descr="" title=""/>
+            <wp:cNvGraphicFramePr>
+              <a:graphicFrameLocks xmlns:a="http://schemas.openxmlformats.org/drawingml/2006/main" noChangeAspect="1"/>
+            </wp:cNvGraphicFramePr>
+            <a:graphic xmlns:a="http://schemas.openxmlformats.org/drawingml/2006/main">
+              <a:graphicData uri="http://schemas.openxmlformats.org/drawingml/2006/picture">
+                <pic:pic xmlns:pic="http://schemas.openxmlformats.org/drawingml/2006/picture">
+                  <pic:nvPicPr>
+                    <pic:cNvPr id="0" name="" descr=""/>
+                    <pic:cNvPicPr>
+                      <a:picLocks noChangeAspect="1" noChangeArrowheads="1"/>
+                    </pic:cNvPicPr>
+                  </pic:nvPicPr>
+                  <pic:blipFill>
+                    <a:blip r:embed="rId12" cstate="none"/>
+                    <a:srcRect/>
+                    <a:stretch>
+                      <a:fillRect/>
+                    </a:stretch>
+                  </pic:blipFill>
+                  <pic:spPr bwMode="auto">
+                    <a:xfrm>
+                      <a:off x="0" y="0"/>
+                      <a:ext cx="5905500" cy="3609975"/>
+                    </a:xfrm>
+                    <a:prstGeom prst="rect">
+                      <a:avLst/>
+                    </a:prstGeom>
+                  </pic:spPr>
+                </pic:pic>
+              </a:graphicData>
+            </a:graphic>
+          </wp:inline>
+        </w:drawing>
+      </w:r>
+    </w:p>
+    <w:p>
+      <w:pPr>
+        <w:spacing w:after="160"/>
+        <w:jc w:val="center"/>
+      </w:pPr>
+      <w:r>
+        <w:rPr>
+          <w:i/>
+          <w:iCs/>
+          <w:color w:val="6B7280"/>
+          <w:sz w:val="17"/>
+          <w:szCs w:val="17"/>
+        </w:rPr>
+        <w:t xml:space="preserve">A four-cue stack running: cue 1 is live and cue 2 is next as dancers sit in side light against a color-washed cyc; per-dancer channel readouts run along the bottom.</w:t>
+      </w:r>
+    </w:p>
+    <w:p>
+      <w:pPr>
         <w:spacing w:after="60" w:before="160"/>
       </w:pPr>
       <w:r>
@@ -2930,6 +3240,68 @@
     </w:p>
     <w:p>
       <w:pPr>
+        <w:spacing w:after="40" w:before="120"/>
+        <w:jc w:val="center"/>
+      </w:pPr>
+      <w:r>
+        <w:drawing>
+          <wp:inline distT="0" distB="0" distL="0" distR="0">
+            <wp:extent cx="5905500" cy="3609975"/>
+            <wp:effectExtent t="0" r="0" b="0" l="0"/>
+            <wp:docPr id="1" name="" descr="" title=""/>
+            <wp:cNvGraphicFramePr>
+              <a:graphicFrameLocks xmlns:a="http://schemas.openxmlformats.org/drawingml/2006/main" noChangeAspect="1"/>
+            </wp:cNvGraphicFramePr>
+            <a:graphic xmlns:a="http://schemas.openxmlformats.org/drawingml/2006/main">
+              <a:graphicData uri="http://schemas.openxmlformats.org/drawingml/2006/picture">
+                <pic:pic xmlns:pic="http://schemas.openxmlformats.org/drawingml/2006/picture">
+                  <pic:nvPicPr>
+                    <pic:cNvPr id="0" name="" descr=""/>
+                    <pic:cNvPicPr>
+                      <a:picLocks noChangeAspect="1" noChangeArrowheads="1"/>
+                    </pic:cNvPicPr>
+                  </pic:nvPicPr>
+                  <pic:blipFill>
+                    <a:blip r:embed="rId13" cstate="none"/>
+                    <a:srcRect/>
+                    <a:stretch>
+                      <a:fillRect/>
+                    </a:stretch>
+                  </pic:blipFill>
+                  <pic:spPr bwMode="auto">
+                    <a:xfrm>
+                      <a:off x="0" y="0"/>
+                      <a:ext cx="5905500" cy="3609975"/>
+                    </a:xfrm>
+                    <a:prstGeom prst="rect">
+                      <a:avLst/>
+                    </a:prstGeom>
+                  </pic:spPr>
+                </pic:pic>
+              </a:graphicData>
+            </a:graphic>
+          </wp:inline>
+        </w:drawing>
+      </w:r>
+    </w:p>
+    <w:p>
+      <w:pPr>
+        <w:spacing w:after="160"/>
+        <w:jc w:val="center"/>
+      </w:pPr>
+      <w:r>
+        <w:rPr>
+          <w:i/>
+          <w:iCs/>
+          <w:color w:val="6B7280"/>
+          <w:sz w:val="17"/>
+          <w:szCs w:val="17"/>
+        </w:rPr>
+        <w:t xml:space="preserve">The Rembrandt preset applied: key, fill, back, and hair lights sit around the 3D head, and the Analysis panel confirms the pattern and the 4.5:1 key-to-fill ratio.</w:t>
+      </w:r>
+    </w:p>
+    <w:p>
+      <w:pPr>
         <w:spacing w:after="60" w:before="160"/>
       </w:pPr>
       <w:r>
@@ -2981,7 +3353,7 @@
           <w:sz w:val="21"/>
           <w:szCs w:val="21"/>
         </w:rPr>
-        <w:t xml:space="preserve">Rembrandt, Butterfly, Split, Loop, Broad, and Short. Students toggle between them and compare what moved.</w:t>
+        <w:t xml:space="preserve">Rembrandt, Butterfly, Split, Loop, Broad, Short, Rim Light, and 3-Point. Students toggle between them and compare what moved.</w:t>
       </w:r>
     </w:p>
     <w:p>
@@ -3226,6 +3598,68 @@
     </w:p>
     <w:p>
       <w:pPr>
+        <w:spacing w:after="40" w:before="120"/>
+        <w:jc w:val="center"/>
+      </w:pPr>
+      <w:r>
+        <w:drawing>
+          <wp:inline distT="0" distB="0" distL="0" distR="0">
+            <wp:extent cx="5905500" cy="3609975"/>
+            <wp:effectExtent t="0" r="0" b="0" l="0"/>
+            <wp:docPr id="1" name="" descr="" title=""/>
+            <wp:cNvGraphicFramePr>
+              <a:graphicFrameLocks xmlns:a="http://schemas.openxmlformats.org/drawingml/2006/main" noChangeAspect="1"/>
+            </wp:cNvGraphicFramePr>
+            <a:graphic xmlns:a="http://schemas.openxmlformats.org/drawingml/2006/main">
+              <a:graphicData uri="http://schemas.openxmlformats.org/drawingml/2006/picture">
+                <pic:pic xmlns:pic="http://schemas.openxmlformats.org/drawingml/2006/picture">
+                  <pic:nvPicPr>
+                    <pic:cNvPr id="0" name="" descr=""/>
+                    <pic:cNvPicPr>
+                      <a:picLocks noChangeAspect="1" noChangeArrowheads="1"/>
+                    </pic:cNvPicPr>
+                  </pic:nvPicPr>
+                  <pic:blipFill>
+                    <a:blip r:embed="rId14" cstate="none"/>
+                    <a:srcRect/>
+                    <a:stretch>
+                      <a:fillRect/>
+                    </a:stretch>
+                  </pic:blipFill>
+                  <pic:spPr bwMode="auto">
+                    <a:xfrm>
+                      <a:off x="0" y="0"/>
+                      <a:ext cx="5905500" cy="3609975"/>
+                    </a:xfrm>
+                    <a:prstGeom prst="rect">
+                      <a:avLst/>
+                    </a:prstGeom>
+                  </pic:spPr>
+                </pic:pic>
+              </a:graphicData>
+            </a:graphic>
+          </wp:inline>
+        </w:drawing>
+      </w:r>
+    </w:p>
+    <w:p>
+      <w:pPr>
+        <w:spacing w:after="160"/>
+        <w:jc w:val="center"/>
+      </w:pPr>
+      <w:r>
+        <w:rPr>
+          <w:i/>
+          <w:iCs/>
+          <w:color w:val="6B7280"/>
+          <w:sz w:val="17"/>
+          <w:szCs w:val="17"/>
+        </w:rPr>
+        <w:t xml:space="preserve">The three-point starting rig — key softbox, fill umbrella, back fresnel — with the Learning Meter reading exposure, ratio, fill, and shadow, and the shot plan building at right.</w:t>
+      </w:r>
+    </w:p>
+    <w:p>
+      <w:pPr>
         <w:spacing w:after="60" w:before="160"/>
       </w:pPr>
       <w:r>
@@ -3528,6 +3962,68 @@
     </w:p>
     <w:p>
       <w:pPr>
+        <w:spacing w:after="40" w:before="120"/>
+        <w:jc w:val="center"/>
+      </w:pPr>
+      <w:r>
+        <w:drawing>
+          <wp:inline distT="0" distB="0" distL="0" distR="0">
+            <wp:extent cx="5905500" cy="3609975"/>
+            <wp:effectExtent t="0" r="0" b="0" l="0"/>
+            <wp:docPr id="1" name="" descr="" title=""/>
+            <wp:cNvGraphicFramePr>
+              <a:graphicFrameLocks xmlns:a="http://schemas.openxmlformats.org/drawingml/2006/main" noChangeAspect="1"/>
+            </wp:cNvGraphicFramePr>
+            <a:graphic xmlns:a="http://schemas.openxmlformats.org/drawingml/2006/main">
+              <a:graphicData uri="http://schemas.openxmlformats.org/drawingml/2006/picture">
+                <pic:pic xmlns:pic="http://schemas.openxmlformats.org/drawingml/2006/picture">
+                  <pic:nvPicPr>
+                    <pic:cNvPr id="0" name="" descr=""/>
+                    <pic:cNvPicPr>
+                      <a:picLocks noChangeAspect="1" noChangeArrowheads="1"/>
+                    </pic:cNvPicPr>
+                  </pic:nvPicPr>
+                  <pic:blipFill>
+                    <a:blip r:embed="rId15" cstate="none"/>
+                    <a:srcRect/>
+                    <a:stretch>
+                      <a:fillRect/>
+                    </a:stretch>
+                  </pic:blipFill>
+                  <pic:spPr bwMode="auto">
+                    <a:xfrm>
+                      <a:off x="0" y="0"/>
+                      <a:ext cx="5905500" cy="3609975"/>
+                    </a:xfrm>
+                    <a:prstGeom prst="rect">
+                      <a:avLst/>
+                    </a:prstGeom>
+                  </pic:spPr>
+                </pic:pic>
+              </a:graphicData>
+            </a:graphic>
+          </wp:inline>
+        </w:drawing>
+      </w:r>
+    </w:p>
+    <w:p>
+      <w:pPr>
+        <w:spacing w:after="160"/>
+        <w:jc w:val="center"/>
+      </w:pPr>
+      <w:r>
+        <w:rPr>
+          <w:i/>
+          <w:iCs/>
+          <w:color w:val="6B7280"/>
+          <w:sz w:val="17"/>
+          <w:szCs w:val="17"/>
+        </w:rPr>
+        <w:t xml:space="preserve">A speech-reinforcement design under test: stage, audience, and FOH zones with gear placed — and the Test Checklist explaining exactly what still blocks the signal path.</w:t>
+      </w:r>
+    </w:p>
+    <w:p>
+      <w:pPr>
         <w:spacing w:after="60" w:before="160"/>
       </w:pPr>
       <w:r>
@@ -3872,6 +4368,68 @@
     </w:p>
     <w:p>
       <w:pPr>
+        <w:spacing w:after="40" w:before="120"/>
+        <w:jc w:val="center"/>
+      </w:pPr>
+      <w:r>
+        <w:drawing>
+          <wp:inline distT="0" distB="0" distL="0" distR="0">
+            <wp:extent cx="5905500" cy="3609975"/>
+            <wp:effectExtent t="0" r="0" b="0" l="0"/>
+            <wp:docPr id="1" name="" descr="" title=""/>
+            <wp:cNvGraphicFramePr>
+              <a:graphicFrameLocks xmlns:a="http://schemas.openxmlformats.org/drawingml/2006/main" noChangeAspect="1"/>
+            </wp:cNvGraphicFramePr>
+            <a:graphic xmlns:a="http://schemas.openxmlformats.org/drawingml/2006/main">
+              <a:graphicData uri="http://schemas.openxmlformats.org/drawingml/2006/picture">
+                <pic:pic xmlns:pic="http://schemas.openxmlformats.org/drawingml/2006/picture">
+                  <pic:nvPicPr>
+                    <pic:cNvPr id="0" name="" descr=""/>
+                    <pic:cNvPicPr>
+                      <a:picLocks noChangeAspect="1" noChangeArrowheads="1"/>
+                    </pic:cNvPicPr>
+                  </pic:nvPicPr>
+                  <pic:blipFill>
+                    <a:blip r:embed="rId16" cstate="none"/>
+                    <a:srcRect/>
+                    <a:stretch>
+                      <a:fillRect/>
+                    </a:stretch>
+                  </pic:blipFill>
+                  <pic:spPr bwMode="auto">
+                    <a:xfrm>
+                      <a:off x="0" y="0"/>
+                      <a:ext cx="5905500" cy="3609975"/>
+                    </a:xfrm>
+                    <a:prstGeom prst="rect">
+                      <a:avLst/>
+                    </a:prstGeom>
+                  </pic:spPr>
+                </pic:pic>
+              </a:graphicData>
+            </a:graphic>
+          </wp:inline>
+        </w:drawing>
+      </w:r>
+    </w:p>
+    <w:p>
+      <w:pPr>
+        <w:spacing w:after="160"/>
+        <w:jc w:val="center"/>
+      </w:pPr>
+      <w:r>
+        <w:rPr>
+          <w:i/>
+          <w:iCs/>
+          <w:color w:val="6B7280"/>
+          <w:sz w:val="17"/>
+          <w:szCs w:val="17"/>
+        </w:rPr>
+        <w:t xml:space="preserve">The “Build your first show” tutorial checking itself off: four synthesized practice sounds in a six-cue stack with a Fade and a Wait, and the GO button armed.</w:t>
+      </w:r>
+    </w:p>
+    <w:p>
+      <w:pPr>
         <w:spacing w:after="60" w:before="160"/>
       </w:pPr>
       <w:r>
@@ -4150,6 +4708,68 @@
     </w:p>
     <w:p>
       <w:pPr>
+        <w:spacing w:after="40" w:before="120"/>
+        <w:jc w:val="center"/>
+      </w:pPr>
+      <w:r>
+        <w:drawing>
+          <wp:inline distT="0" distB="0" distL="0" distR="0">
+            <wp:extent cx="5905500" cy="3609975"/>
+            <wp:effectExtent t="0" r="0" b="0" l="0"/>
+            <wp:docPr id="1" name="" descr="" title=""/>
+            <wp:cNvGraphicFramePr>
+              <a:graphicFrameLocks xmlns:a="http://schemas.openxmlformats.org/drawingml/2006/main" noChangeAspect="1"/>
+            </wp:cNvGraphicFramePr>
+            <a:graphic xmlns:a="http://schemas.openxmlformats.org/drawingml/2006/main">
+              <a:graphicData uri="http://schemas.openxmlformats.org/drawingml/2006/picture">
+                <pic:pic xmlns:pic="http://schemas.openxmlformats.org/drawingml/2006/picture">
+                  <pic:nvPicPr>
+                    <pic:cNvPr id="0" name="" descr=""/>
+                    <pic:cNvPicPr>
+                      <a:picLocks noChangeAspect="1" noChangeArrowheads="1"/>
+                    </pic:cNvPicPr>
+                  </pic:nvPicPr>
+                  <pic:blipFill>
+                    <a:blip r:embed="rId17" cstate="none"/>
+                    <a:srcRect/>
+                    <a:stretch>
+                      <a:fillRect/>
+                    </a:stretch>
+                  </pic:blipFill>
+                  <pic:spPr bwMode="auto">
+                    <a:xfrm>
+                      <a:off x="0" y="0"/>
+                      <a:ext cx="5905500" cy="3609975"/>
+                    </a:xfrm>
+                    <a:prstGeom prst="rect">
+                      <a:avLst/>
+                    </a:prstGeom>
+                  </pic:spPr>
+                </pic:pic>
+              </a:graphicData>
+            </a:graphic>
+          </wp:inline>
+        </w:drawing>
+      </w:r>
+    </w:p>
+    <w:p>
+      <w:pPr>
+        <w:spacing w:after="160"/>
+        <w:jc w:val="center"/>
+      </w:pPr>
+      <w:r>
+        <w:rPr>
+          <w:i/>
+          <w:iCs/>
+          <w:color w:val="6B7280"/>
+          <w:sz w:val="17"/>
+          <w:szCs w:val="17"/>
+        </w:rPr>
+        <w:t xml:space="preserve">Practice on The Importance of Being Earnest: Gwendolen’s line falls toward the mix line while the teleprompter scrolls the scene above and the DCA faders wait below.</w:t>
+      </w:r>
+    </w:p>
+    <w:p>
+      <w:pPr>
         <w:spacing w:after="60" w:before="160"/>
       </w:pPr>
       <w:r>
@@ -4448,6 +5068,68 @@
           <w:szCs w:val="21"/>
         </w:rPr>
         <w:t xml:space="preserve">“I can design a costume that fits the character, the time period, and the scene.”</w:t>
+      </w:r>
+    </w:p>
+    <w:p>
+      <w:pPr>
+        <w:spacing w:after="40" w:before="120"/>
+        <w:jc w:val="center"/>
+      </w:pPr>
+      <w:r>
+        <w:drawing>
+          <wp:inline distT="0" distB="0" distL="0" distR="0">
+            <wp:extent cx="5905500" cy="3609975"/>
+            <wp:effectExtent t="0" r="0" b="0" l="0"/>
+            <wp:docPr id="1" name="" descr="" title=""/>
+            <wp:cNvGraphicFramePr>
+              <a:graphicFrameLocks xmlns:a="http://schemas.openxmlformats.org/drawingml/2006/main" noChangeAspect="1"/>
+            </wp:cNvGraphicFramePr>
+            <a:graphic xmlns:a="http://schemas.openxmlformats.org/drawingml/2006/main">
+              <a:graphicData uri="http://schemas.openxmlformats.org/drawingml/2006/picture">
+                <pic:pic xmlns:pic="http://schemas.openxmlformats.org/drawingml/2006/picture">
+                  <pic:nvPicPr>
+                    <pic:cNvPr id="0" name="" descr=""/>
+                    <pic:cNvPicPr>
+                      <a:picLocks noChangeAspect="1" noChangeArrowheads="1"/>
+                    </pic:cNvPicPr>
+                  </pic:nvPicPr>
+                  <pic:blipFill>
+                    <a:blip r:embed="rId18" cstate="none"/>
+                    <a:srcRect/>
+                    <a:stretch>
+                      <a:fillRect/>
+                    </a:stretch>
+                  </pic:blipFill>
+                  <pic:spPr bwMode="auto">
+                    <a:xfrm>
+                      <a:off x="0" y="0"/>
+                      <a:ext cx="5905500" cy="3609975"/>
+                    </a:xfrm>
+                    <a:prstGeom prst="rect">
+                      <a:avLst/>
+                    </a:prstGeom>
+                  </pic:spPr>
+                </pic:pic>
+              </a:graphicData>
+            </a:graphic>
+          </wp:inline>
+        </w:drawing>
+      </w:r>
+    </w:p>
+    <w:p>
+      <w:pPr>
+        <w:spacing w:after="160"/>
+        <w:jc w:val="center"/>
+      </w:pPr>
+      <w:r>
+        <w:rPr>
+          <w:i/>
+          <w:iCs/>
+          <w:color w:val="6B7280"/>
+          <w:sz w:val="17"/>
+          <w:szCs w:val="17"/>
+        </w:rPr>
+        <w:t xml:space="preserve">A named look in progress (“Capt. Silver — Act I”): era-tagged wardrobe pieces at right, the colour-and-pattern panel open, and one of the eight design briefs at lower left.</w:t>
       </w:r>
     </w:p>
     <w:p>
@@ -6569,7 +7251,7 @@
           <w:sz w:val="21"/>
           <w:szCs w:val="21"/>
         </w:rPr>
-        <w:t xml:space="preserve">the six classic patterns (Rembrandt, Butterfly, Split, Loop, Broad, Short), key-to-fill ratio, color temperature, and softness. Assignment ladder: recreate every preset and export the comparison sheet → pass the recreate-the-look quiz → reproduce one pattern with a real subject using one light and a reflector, submitting lab render and photograph side by side.</w:t>
+        <w:t xml:space="preserve">eight classic patterns (Rembrandt, Butterfly, Split, Loop, Broad, Short, Rim, 3-Point), key-to-fill ratio, color temperature, and softness. Assignment ladder: recreate every preset and export the comparison sheet → pass the recreate-the-look quiz → reproduce one pattern with a real subject using one light and a reflector, submitting lab render and photograph side by side.</w:t>
       </w:r>
     </w:p>
     <w:p>

</xml_diff>

<commit_message>
Teacher's Guide: cite CA CTE AED Stage & Event Technology standards
Cross-references lab activities to the California CTE Model Curriculum
Standards, Arts, Entertainment & Design cluster (Performance, Music, &
Live Entertainment pathway - Stage & Event Technology focus area):
- standards-alignment note up front explaining the ST citation scheme
- per-lab Standards connections blocks quoting the standard language
- lab-to-standard mapping table under Assessment & Grading
- inline citations in the course-calendar and photo/film sections,
  with a pointer to the Media Production pathway for film courses

Co-Authored-By: Claude Fable 5 <noreply@anthropic.com>
</commit_message>
<xml_diff>
--- a/SDSCPA-Virtual-Labs-Teacher-Guide.docx
+++ b/SDSCPA-Virtual-Labs-Teacher-Guide.docx
@@ -47,7 +47,7 @@
           <w:sz w:val="21"/>
           <w:szCs w:val="21"/>
         </w:rPr>
-        <w:t xml:space="preserve">How each of the ten labs works, what evidence they produce, and how to fold them into tech theatre courses for grades 6–10 — plus photography and film/video classes.</w:t>
+        <w:t xml:space="preserve">How each of the ten labs works, what evidence they produce, and how to fold them into tech theatre courses for grades 6–10 — plus photography and film/video classes. Activities are cross-referenced to the California CTE Model Curriculum Standards, Arts, Entertainment &amp; Design cluster (Stage &amp; Event Technology focus area).</w:t>
       </w:r>
     </w:p>
     <w:p>
@@ -260,6 +260,49 @@
     </w:p>
     <w:p>
       <w:pPr>
+        <w:spacing w:after="60" w:before="160"/>
+      </w:pPr>
+      <w:r>
+        <w:rPr>
+          <w:b/>
+          <w:bCs/>
+          <w:color w:val="6B7280"/>
+          <w:sz w:val="18"/>
+          <w:szCs w:val="18"/>
+        </w:rPr>
+        <w:t xml:space="preserve">STANDARDS ALIGNMENT IN THIS GUIDE</w:t>
+      </w:r>
+    </w:p>
+    <w:p>
+      <w:pPr>
+        <w:spacing w:after="120" w:line="264"/>
+      </w:pPr>
+      <w:r>
+        <w:rPr>
+          <w:color w:val="1F2430"/>
+          <w:sz w:val="21"/>
+          <w:szCs w:val="21"/>
+        </w:rPr>
+        <w:t xml:space="preserve">Lab activities throughout this guide are cross-referenced to the California Career Technical Education Model Curriculum Standards, Arts, Entertainment &amp; Design career cluster — specifically the Stage &amp; Event Technology focus area of the Performance, Music, &amp; Live Entertainment pathway. Those standards (cited here by their ST codes, e.g., ST.17.7 Lighting) describe production design, scenic construction, power and signal, lighting, audio, console operation, and live-event execution — the exact territory these labs cover. Each lab section below lists its strongest connections, and a full lab-to-standard mapping table appears under Assessment &amp; Grading.</w:t>
+      </w:r>
+    </w:p>
+    <w:p>
+      <w:pPr>
+        <w:spacing w:after="200" w:line="264"/>
+      </w:pPr>
+      <w:r>
+        <w:rPr>
+          <w:i/>
+          <w:iCs/>
+          <w:color w:val="6B7280"/>
+          <w:sz w:val="21"/>
+          <w:szCs w:val="21"/>
+        </w:rPr>
+        <w:t xml:space="preserve">The citations carry the most weight in grades 9–10 and CTE-articulated courses, where they can go straight into course outlines and program review. In grades 6–8, read them as the destination the labs are pointed at.</w:t>
+      </w:r>
+    </w:p>
+    <w:p>
+      <w:pPr>
         <w:pStyle w:val="Heading1"/>
         <w:pBdr>
           <w:bottom w:val="single" w:color="1F2430" w:sz="8" w:space="3"/>
@@ -2070,6 +2113,77 @@
           <w:sz w:val="18"/>
           <w:szCs w:val="18"/>
         </w:rPr>
+        <w:t xml:space="preserve">STANDARDS CONNECTIONS</w:t>
+      </w:r>
+    </w:p>
+    <w:p>
+      <w:pPr>
+        <w:pStyle w:val="ListParagraph"/>
+        <w:numPr>
+          <w:ilvl w:val="0"/>
+          <w:numId w:val="2"/>
+        </w:numPr>
+        <w:spacing w:after="60" w:line="264"/>
+      </w:pPr>
+      <w:r>
+        <w:rPr>
+          <w:b/>
+          <w:bCs/>
+          <w:color w:val="1F2430"/>
+          <w:sz w:val="21"/>
+          <w:szCs w:val="21"/>
+        </w:rPr>
+        <w:t xml:space="preserve">ST.17.4 Scenic &amp; Props: </w:t>
+      </w:r>
+      <w:r>
+        <w:rPr>
+          <w:color w:val="1F2430"/>
+          <w:sz w:val="21"/>
+          <w:szCs w:val="21"/>
+        </w:rPr>
+        <w:t xml:space="preserve">“design, source and construct scenic and property elements … apply safety practices, adhere to industry-standard regulations, and ensure technical reliability.” Framing anatomy, correct part placement, and the verified build quiz are this standard in miniature.</w:t>
+      </w:r>
+    </w:p>
+    <w:p>
+      <w:pPr>
+        <w:pStyle w:val="ListParagraph"/>
+        <w:numPr>
+          <w:ilvl w:val="0"/>
+          <w:numId w:val="2"/>
+        </w:numPr>
+        <w:spacing w:after="60" w:line="264"/>
+      </w:pPr>
+      <w:r>
+        <w:rPr>
+          <w:b/>
+          <w:bCs/>
+          <w:color w:val="1F2430"/>
+          <w:sz w:val="21"/>
+          <w:szCs w:val="21"/>
+        </w:rPr>
+        <w:t xml:space="preserve">ST.18.1 Reading Technical Drawings: </w:t>
+      </w:r>
+      <w:r>
+        <w:rPr>
+          <w:color w:val="1F2430"/>
+          <w:sz w:val="21"/>
+          <w:szCs w:val="21"/>
+        </w:rPr>
+        <w:t xml:space="preserve">“translate documents into actionable production tasks using scale and industry notation.” Scale selection, dimensioning, and the self-building cut list train exactly that translation.</w:t>
+      </w:r>
+    </w:p>
+    <w:p>
+      <w:pPr>
+        <w:spacing w:after="60" w:before="160"/>
+      </w:pPr>
+      <w:r>
+        <w:rPr>
+          <w:b/>
+          <w:bCs/>
+          <w:color w:val="6B7280"/>
+          <w:sz w:val="18"/>
+          <w:szCs w:val="18"/>
+        </w:rPr>
         <w:t xml:space="preserve">CLASSROOM IDEAS</w:t>
       </w:r>
     </w:p>
@@ -2438,6 +2552,77 @@
           <w:sz w:val="18"/>
           <w:szCs w:val="18"/>
         </w:rPr>
+        <w:t xml:space="preserve">STANDARDS CONNECTIONS</w:t>
+      </w:r>
+    </w:p>
+    <w:p>
+      <w:pPr>
+        <w:pStyle w:val="ListParagraph"/>
+        <w:numPr>
+          <w:ilvl w:val="0"/>
+          <w:numId w:val="2"/>
+        </w:numPr>
+        <w:spacing w:after="60" w:line="264"/>
+      </w:pPr>
+      <w:r>
+        <w:rPr>
+          <w:b/>
+          <w:bCs/>
+          <w:color w:val="1F2430"/>
+          <w:sz w:val="21"/>
+          <w:szCs w:val="21"/>
+        </w:rPr>
+        <w:t xml:space="preserve">ST.17.1 Production Design Fundamentals: </w:t>
+      </w:r>
+      <w:r>
+        <w:rPr>
+          <w:color w:val="1F2430"/>
+          <w:sz w:val="21"/>
+          <w:szCs w:val="21"/>
+        </w:rPr>
+        <w:t xml:space="preserve">“apply principles of art and design to production elements … to shape audience perception and performer interaction” — shaping audience perception is the explicit point of all five composition challenges.</w:t>
+      </w:r>
+    </w:p>
+    <w:p>
+      <w:pPr>
+        <w:pStyle w:val="ListParagraph"/>
+        <w:numPr>
+          <w:ilvl w:val="0"/>
+          <w:numId w:val="2"/>
+        </w:numPr>
+        <w:spacing w:after="60" w:line="264"/>
+      </w:pPr>
+      <w:r>
+        <w:rPr>
+          <w:b/>
+          <w:bCs/>
+          <w:color w:val="1F2430"/>
+          <w:sz w:val="21"/>
+          <w:szCs w:val="21"/>
+        </w:rPr>
+        <w:t xml:space="preserve">ST.18.2 Event Design Software Tools: </w:t>
+      </w:r>
+      <w:r>
+        <w:rPr>
+          <w:color w:val="1F2430"/>
+          <w:sz w:val="21"/>
+          <w:szCs w:val="21"/>
+        </w:rPr>
+        <w:t xml:space="preserve">“create virtual stage models … and determine technical feasibility and alignment with creative direction.” The lab is precisely such a previsualization tool, with sightline feasibility checked live.</w:t>
+      </w:r>
+    </w:p>
+    <w:p>
+      <w:pPr>
+        <w:spacing w:after="60" w:before="160"/>
+      </w:pPr>
+      <w:r>
+        <w:rPr>
+          <w:b/>
+          <w:bCs/>
+          <w:color w:val="6B7280"/>
+          <w:sz w:val="18"/>
+          <w:szCs w:val="18"/>
+        </w:rPr>
         <w:t xml:space="preserve">CLASSROOM IDEAS</w:t>
       </w:r>
     </w:p>
@@ -2740,6 +2925,77 @@
           <w:sz w:val="18"/>
           <w:szCs w:val="18"/>
         </w:rPr>
+        <w:t xml:space="preserve">STANDARDS CONNECTIONS</w:t>
+      </w:r>
+    </w:p>
+    <w:p>
+      <w:pPr>
+        <w:pStyle w:val="ListParagraph"/>
+        <w:numPr>
+          <w:ilvl w:val="0"/>
+          <w:numId w:val="2"/>
+        </w:numPr>
+        <w:spacing w:after="60" w:line="264"/>
+      </w:pPr>
+      <w:r>
+        <w:rPr>
+          <w:b/>
+          <w:bCs/>
+          <w:color w:val="1F2430"/>
+          <w:sz w:val="21"/>
+          <w:szCs w:val="21"/>
+        </w:rPr>
+        <w:t xml:space="preserve">ST.18.1 Reading Technical Drawings: </w:t>
+      </w:r>
+      <w:r>
+        <w:rPr>
+          <w:color w:val="1F2430"/>
+          <w:sz w:val="21"/>
+          <w:szCs w:val="21"/>
+        </w:rPr>
+        <w:t xml:space="preserve">“interpret technical drawings, stage plots, schematics … using scale and industry notation to ensure precision, safety, and alignment with design intent.” The Draft This challenges grade precisely that precision, at two tolerances.</w:t>
+      </w:r>
+    </w:p>
+    <w:p>
+      <w:pPr>
+        <w:pStyle w:val="ListParagraph"/>
+        <w:numPr>
+          <w:ilvl w:val="0"/>
+          <w:numId w:val="2"/>
+        </w:numPr>
+        <w:spacing w:after="60" w:line="264"/>
+      </w:pPr>
+      <w:r>
+        <w:rPr>
+          <w:b/>
+          <w:bCs/>
+          <w:color w:val="1F2430"/>
+          <w:sz w:val="21"/>
+          <w:szCs w:val="21"/>
+        </w:rPr>
+        <w:t xml:space="preserve">ST.18.2 Event Design Software Tools: </w:t>
+      </w:r>
+      <w:r>
+        <w:rPr>
+          <w:color w:val="1F2430"/>
+          <w:sz w:val="21"/>
+          <w:szCs w:val="21"/>
+        </w:rPr>
+        <w:t xml:space="preserve">the lab mirrors the “industry-standard software (e.g., CAD …)” workflow the standard names — snapping, editable dimensions, line weights — without the license cost.</w:t>
+      </w:r>
+    </w:p>
+    <w:p>
+      <w:pPr>
+        <w:spacing w:after="60" w:before="160"/>
+      </w:pPr>
+      <w:r>
+        <w:rPr>
+          <w:b/>
+          <w:bCs/>
+          <w:color w:val="6B7280"/>
+          <w:sz w:val="18"/>
+          <w:szCs w:val="18"/>
+        </w:rPr>
         <w:t xml:space="preserve">CLASSROOM IDEAS</w:t>
       </w:r>
     </w:p>
@@ -3104,6 +3360,77 @@
           <w:sz w:val="18"/>
           <w:szCs w:val="18"/>
         </w:rPr>
+        <w:t xml:space="preserve">STANDARDS CONNECTIONS</w:t>
+      </w:r>
+    </w:p>
+    <w:p>
+      <w:pPr>
+        <w:pStyle w:val="ListParagraph"/>
+        <w:numPr>
+          <w:ilvl w:val="0"/>
+          <w:numId w:val="2"/>
+        </w:numPr>
+        <w:spacing w:after="60" w:line="264"/>
+      </w:pPr>
+      <w:r>
+        <w:rPr>
+          <w:b/>
+          <w:bCs/>
+          <w:color w:val="1F2430"/>
+          <w:sz w:val="21"/>
+          <w:szCs w:val="21"/>
+        </w:rPr>
+        <w:t xml:space="preserve">ST.17.7 Lighting: </w:t>
+      </w:r>
+      <w:r>
+        <w:rPr>
+          <w:color w:val="1F2430"/>
+          <w:sz w:val="21"/>
+          <w:szCs w:val="21"/>
+        </w:rPr>
+        <w:t xml:space="preserve">“control intensity, hue, saturation, position, and effects to enhance mood, direct audience focus, and ensure performer and production safety.” The lab’s channels, gels, gobos, and focus tools map onto this standard one for one.</w:t>
+      </w:r>
+    </w:p>
+    <w:p>
+      <w:pPr>
+        <w:pStyle w:val="ListParagraph"/>
+        <w:numPr>
+          <w:ilvl w:val="0"/>
+          <w:numId w:val="2"/>
+        </w:numPr>
+        <w:spacing w:after="60" w:line="264"/>
+      </w:pPr>
+      <w:r>
+        <w:rPr>
+          <w:b/>
+          <w:bCs/>
+          <w:color w:val="1F2430"/>
+          <w:sz w:val="21"/>
+          <w:szCs w:val="21"/>
+        </w:rPr>
+        <w:t xml:space="preserve">ST.18.3 Console Operation: </w:t>
+      </w:r>
+      <w:r>
+        <w:rPr>
+          <w:color w:val="1F2430"/>
+          <w:sz w:val="21"/>
+          <w:szCs w:val="21"/>
+        </w:rPr>
+        <w:t xml:space="preserve">“program and operate control consoles for lighting … manage cues, transitions, and real-time adjustments (e.g., levels, timing).” The Eos-style command line and cue stack are a direct rehearsal for the real console.</w:t>
+      </w:r>
+    </w:p>
+    <w:p>
+      <w:pPr>
+        <w:spacing w:after="60" w:before="160"/>
+      </w:pPr>
+      <w:r>
+        <w:rPr>
+          <w:b/>
+          <w:bCs/>
+          <w:color w:val="6B7280"/>
+          <w:sz w:val="18"/>
+          <w:szCs w:val="18"/>
+        </w:rPr>
         <w:t xml:space="preserve">CLASSROOM IDEAS</w:t>
       </w:r>
     </w:p>
@@ -3480,6 +3807,77 @@
           <w:sz w:val="18"/>
           <w:szCs w:val="18"/>
         </w:rPr>
+        <w:t xml:space="preserve">STANDARDS CONNECTIONS</w:t>
+      </w:r>
+    </w:p>
+    <w:p>
+      <w:pPr>
+        <w:pStyle w:val="ListParagraph"/>
+        <w:numPr>
+          <w:ilvl w:val="0"/>
+          <w:numId w:val="2"/>
+        </w:numPr>
+        <w:spacing w:after="60" w:line="264"/>
+      </w:pPr>
+      <w:r>
+        <w:rPr>
+          <w:b/>
+          <w:bCs/>
+          <w:color w:val="1F2430"/>
+          <w:sz w:val="21"/>
+          <w:szCs w:val="21"/>
+        </w:rPr>
+        <w:t xml:space="preserve">ST.17.7 Lighting: </w:t>
+      </w:r>
+      <w:r>
+        <w:rPr>
+          <w:color w:val="1F2430"/>
+          <w:sz w:val="21"/>
+          <w:szCs w:val="21"/>
+        </w:rPr>
+        <w:t xml:space="preserve">controlling “intensity, hue, saturation, position, and effects to enhance mood [and] direct audience focus” applies to a lens exactly as it does to a stage — here with instant feedback on a rendered face.</w:t>
+      </w:r>
+    </w:p>
+    <w:p>
+      <w:pPr>
+        <w:pStyle w:val="ListParagraph"/>
+        <w:numPr>
+          <w:ilvl w:val="0"/>
+          <w:numId w:val="2"/>
+        </w:numPr>
+        <w:spacing w:after="60" w:line="264"/>
+      </w:pPr>
+      <w:r>
+        <w:rPr>
+          <w:b/>
+          <w:bCs/>
+          <w:color w:val="1F2430"/>
+          <w:sz w:val="21"/>
+          <w:szCs w:val="21"/>
+        </w:rPr>
+        <w:t xml:space="preserve">ST.18.4 Design &amp; Test: </w:t>
+      </w:r>
+      <w:r>
+        <w:rPr>
+          <w:color w:val="1F2430"/>
+          <w:sz w:val="21"/>
+          <w:szCs w:val="21"/>
+        </w:rPr>
+        <w:t xml:space="preserve">“evaluate, and refine technical and creative design elements … to finalize artistic decisions.” The recreate-a-pattern quiz is a tight evaluate-and-refine loop with tolerances.</w:t>
+      </w:r>
+    </w:p>
+    <w:p>
+      <w:pPr>
+        <w:spacing w:after="60" w:before="160"/>
+      </w:pPr>
+      <w:r>
+        <w:rPr>
+          <w:b/>
+          <w:bCs/>
+          <w:color w:val="6B7280"/>
+          <w:sz w:val="18"/>
+          <w:szCs w:val="18"/>
+        </w:rPr>
         <w:t xml:space="preserve">CLASSROOM IDEAS</w:t>
       </w:r>
     </w:p>
@@ -3820,6 +4218,77 @@
           <w:sz w:val="18"/>
           <w:szCs w:val="18"/>
         </w:rPr>
+        <w:t xml:space="preserve">STANDARDS CONNECTIONS</w:t>
+      </w:r>
+    </w:p>
+    <w:p>
+      <w:pPr>
+        <w:pStyle w:val="ListParagraph"/>
+        <w:numPr>
+          <w:ilvl w:val="0"/>
+          <w:numId w:val="2"/>
+        </w:numPr>
+        <w:spacing w:after="60" w:line="264"/>
+      </w:pPr>
+      <w:r>
+        <w:rPr>
+          <w:b/>
+          <w:bCs/>
+          <w:color w:val="1F2430"/>
+          <w:sz w:val="21"/>
+          <w:szCs w:val="21"/>
+        </w:rPr>
+        <w:t xml:space="preserve">ST.17.1 Production Design Fundamentals: </w:t>
+      </w:r>
+      <w:r>
+        <w:rPr>
+          <w:color w:val="1F2430"/>
+          <w:sz w:val="21"/>
+          <w:szCs w:val="21"/>
+        </w:rPr>
+        <w:t xml:space="preserve">“determine design and technical requirements for various types of venues and live events (e.g., … presentations)” — each challenge is exactly such a requirements brief (cover shoot, interview, catalog).</w:t>
+      </w:r>
+    </w:p>
+    <w:p>
+      <w:pPr>
+        <w:pStyle w:val="ListParagraph"/>
+        <w:numPr>
+          <w:ilvl w:val="0"/>
+          <w:numId w:val="2"/>
+        </w:numPr>
+        <w:spacing w:after="60" w:line="264"/>
+      </w:pPr>
+      <w:r>
+        <w:rPr>
+          <w:b/>
+          <w:bCs/>
+          <w:color w:val="1F2430"/>
+          <w:sz w:val="21"/>
+          <w:szCs w:val="21"/>
+        </w:rPr>
+        <w:t xml:space="preserve">ST.17.7 Lighting: </w:t>
+      </w:r>
+      <w:r>
+        <w:rPr>
+          <w:color w:val="1F2430"/>
+          <w:sz w:val="21"/>
+          <w:szCs w:val="21"/>
+        </w:rPr>
+        <w:t xml:space="preserve">installing, operating, and adjusting instruments to “enhance mood [and] direct audience focus,” with the shot plan documenting the choices the way a crew would need them.</w:t>
+      </w:r>
+    </w:p>
+    <w:p>
+      <w:pPr>
+        <w:spacing w:after="60" w:before="160"/>
+      </w:pPr>
+      <w:r>
+        <w:rPr>
+          <w:b/>
+          <w:bCs/>
+          <w:color w:val="6B7280"/>
+          <w:sz w:val="18"/>
+          <w:szCs w:val="18"/>
+        </w:rPr>
         <w:t xml:space="preserve">CLASSROOM IDEAS</w:t>
       </w:r>
     </w:p>
@@ -4250,6 +4719,105 @@
           <w:sz w:val="18"/>
           <w:szCs w:val="18"/>
         </w:rPr>
+        <w:t xml:space="preserve">STANDARDS CONNECTIONS</w:t>
+      </w:r>
+    </w:p>
+    <w:p>
+      <w:pPr>
+        <w:pStyle w:val="ListParagraph"/>
+        <w:numPr>
+          <w:ilvl w:val="0"/>
+          <w:numId w:val="2"/>
+        </w:numPr>
+        <w:spacing w:after="60" w:line="264"/>
+      </w:pPr>
+      <w:r>
+        <w:rPr>
+          <w:b/>
+          <w:bCs/>
+          <w:color w:val="1F2430"/>
+          <w:sz w:val="21"/>
+          <w:szCs w:val="21"/>
+        </w:rPr>
+        <w:t xml:space="preserve">ST.17.8 Audio: </w:t>
+      </w:r>
+      <w:r>
+        <w:rPr>
+          <w:color w:val="1F2430"/>
+          <w:sz w:val="21"/>
+          <w:szCs w:val="21"/>
+        </w:rPr>
+        <w:t xml:space="preserve">“select, install, operate, and adjust sound equipment (e.g., microphones, speakers, mixers, amplifiers …); route audio, and calibrate systems to deliver clear, balanced, and reliable sound.” This is the whole lab in one sentence.</w:t>
+      </w:r>
+    </w:p>
+    <w:p>
+      <w:pPr>
+        <w:pStyle w:val="ListParagraph"/>
+        <w:numPr>
+          <w:ilvl w:val="0"/>
+          <w:numId w:val="2"/>
+        </w:numPr>
+        <w:spacing w:after="60" w:line="264"/>
+      </w:pPr>
+      <w:r>
+        <w:rPr>
+          <w:b/>
+          <w:bCs/>
+          <w:color w:val="1F2430"/>
+          <w:sz w:val="21"/>
+          <w:szCs w:val="21"/>
+        </w:rPr>
+        <w:t xml:space="preserve">ST.17.5 Power &amp; Data Systems: </w:t>
+      </w:r>
+      <w:r>
+        <w:rPr>
+          <w:color w:val="1F2430"/>
+          <w:sz w:val="21"/>
+          <w:szCs w:val="21"/>
+        </w:rPr>
+        <w:t xml:space="preserve">“signal flow, networking, connectors, cabling, show power” — Test System refuses to pass a design until both the audio path and the power path are safe and complete.</w:t>
+      </w:r>
+    </w:p>
+    <w:p>
+      <w:pPr>
+        <w:pStyle w:val="ListParagraph"/>
+        <w:numPr>
+          <w:ilvl w:val="0"/>
+          <w:numId w:val="2"/>
+        </w:numPr>
+        <w:spacing w:after="60" w:line="264"/>
+      </w:pPr>
+      <w:r>
+        <w:rPr>
+          <w:b/>
+          <w:bCs/>
+          <w:color w:val="1F2430"/>
+          <w:sz w:val="21"/>
+          <w:szCs w:val="21"/>
+        </w:rPr>
+        <w:t xml:space="preserve">ST.18.7 Live Equipment Troubleshooting: </w:t>
+      </w:r>
+      <w:r>
+        <w:rPr>
+          <w:color w:val="1F2430"/>
+          <w:sz w:val="21"/>
+          <w:szCs w:val="21"/>
+        </w:rPr>
+        <w:t xml:space="preserve">“diagnose and correct equipment issues (e.g., cabling faults …).” Troubleshooting mode is this standard turned into a game.</w:t>
+      </w:r>
+    </w:p>
+    <w:p>
+      <w:pPr>
+        <w:spacing w:after="60" w:before="160"/>
+      </w:pPr>
+      <w:r>
+        <w:rPr>
+          <w:b/>
+          <w:bCs/>
+          <w:color w:val="6B7280"/>
+          <w:sz w:val="18"/>
+          <w:szCs w:val="18"/>
+        </w:rPr>
         <w:t xml:space="preserve">CLASSROOM IDEAS</w:t>
       </w:r>
     </w:p>
@@ -4590,6 +5158,105 @@
           <w:sz w:val="18"/>
           <w:szCs w:val="18"/>
         </w:rPr>
+        <w:t xml:space="preserve">STANDARDS CONNECTIONS</w:t>
+      </w:r>
+    </w:p>
+    <w:p>
+      <w:pPr>
+        <w:pStyle w:val="ListParagraph"/>
+        <w:numPr>
+          <w:ilvl w:val="0"/>
+          <w:numId w:val="2"/>
+        </w:numPr>
+        <w:spacing w:after="60" w:line="264"/>
+      </w:pPr>
+      <w:r>
+        <w:rPr>
+          <w:b/>
+          <w:bCs/>
+          <w:color w:val="1F2430"/>
+          <w:sz w:val="21"/>
+          <w:szCs w:val="21"/>
+        </w:rPr>
+        <w:t xml:space="preserve">ST.18.3 Console Operation: </w:t>
+      </w:r>
+      <w:r>
+        <w:rPr>
+          <w:color w:val="1F2430"/>
+          <w:sz w:val="21"/>
+          <w:szCs w:val="21"/>
+        </w:rPr>
+        <w:t xml:space="preserve">“manage cues, transitions, and real-time adjustments” — cue types, pre-waits, auto-follows, and fade curves are the transition grammar of every show-control system.</w:t>
+      </w:r>
+    </w:p>
+    <w:p>
+      <w:pPr>
+        <w:pStyle w:val="ListParagraph"/>
+        <w:numPr>
+          <w:ilvl w:val="0"/>
+          <w:numId w:val="2"/>
+        </w:numPr>
+        <w:spacing w:after="60" w:line="264"/>
+      </w:pPr>
+      <w:r>
+        <w:rPr>
+          <w:b/>
+          <w:bCs/>
+          <w:color w:val="1F2430"/>
+          <w:sz w:val="21"/>
+          <w:szCs w:val="21"/>
+        </w:rPr>
+        <w:t xml:space="preserve">ST.18.8 Live Event Execution: </w:t>
+      </w:r>
+      <w:r>
+        <w:rPr>
+          <w:color w:val="1F2430"/>
+          <w:sz w:val="21"/>
+          <w:szCs w:val="21"/>
+        </w:rPr>
+        <w:t xml:space="preserve">“operate all technical systems during a live event, following cues, maintaining safety, and managing show flow.” Running the stack on GO — with a panic stop — is show flow in miniature.</w:t>
+      </w:r>
+    </w:p>
+    <w:p>
+      <w:pPr>
+        <w:pStyle w:val="ListParagraph"/>
+        <w:numPr>
+          <w:ilvl w:val="0"/>
+          <w:numId w:val="2"/>
+        </w:numPr>
+        <w:spacing w:after="60" w:line="264"/>
+      </w:pPr>
+      <w:r>
+        <w:rPr>
+          <w:b/>
+          <w:bCs/>
+          <w:color w:val="1F2430"/>
+          <w:sz w:val="21"/>
+          <w:szCs w:val="21"/>
+        </w:rPr>
+        <w:t xml:space="preserve">ST.18.2 Event Design Software Tools: </w:t>
+      </w:r>
+      <w:r>
+        <w:rPr>
+          <w:color w:val="1F2430"/>
+          <w:sz w:val="21"/>
+          <w:szCs w:val="21"/>
+        </w:rPr>
+        <w:t xml:space="preserve">the lab is one of the “show flow [and] cuing … programs” the standard expects students to use.</w:t>
+      </w:r>
+    </w:p>
+    <w:p>
+      <w:pPr>
+        <w:spacing w:after="60" w:before="160"/>
+      </w:pPr>
+      <w:r>
+        <w:rPr>
+          <w:b/>
+          <w:bCs/>
+          <w:color w:val="6B7280"/>
+          <w:sz w:val="18"/>
+          <w:szCs w:val="18"/>
+        </w:rPr>
         <w:t xml:space="preserve">CLASSROOM IDEAS</w:t>
       </w:r>
     </w:p>
@@ -4930,6 +5597,77 @@
           <w:sz w:val="18"/>
           <w:szCs w:val="18"/>
         </w:rPr>
+        <w:t xml:space="preserve">STANDARDS CONNECTIONS</w:t>
+      </w:r>
+    </w:p>
+    <w:p>
+      <w:pPr>
+        <w:pStyle w:val="ListParagraph"/>
+        <w:numPr>
+          <w:ilvl w:val="0"/>
+          <w:numId w:val="2"/>
+        </w:numPr>
+        <w:spacing w:after="60" w:line="264"/>
+      </w:pPr>
+      <w:r>
+        <w:rPr>
+          <w:b/>
+          <w:bCs/>
+          <w:color w:val="1F2430"/>
+          <w:sz w:val="21"/>
+          <w:szCs w:val="21"/>
+        </w:rPr>
+        <w:t xml:space="preserve">ST.17.8 Audio: </w:t>
+      </w:r>
+      <w:r>
+        <w:rPr>
+          <w:color w:val="1F2430"/>
+          <w:sz w:val="21"/>
+          <w:szCs w:val="21"/>
+        </w:rPr>
+        <w:t xml:space="preserve">operating mixers “to deliver clear, balanced, and reliable sound” — line mixing is the discipline that keeps a musical’s dialogue clear and its stage quiet.</w:t>
+      </w:r>
+    </w:p>
+    <w:p>
+      <w:pPr>
+        <w:pStyle w:val="ListParagraph"/>
+        <w:numPr>
+          <w:ilvl w:val="0"/>
+          <w:numId w:val="2"/>
+        </w:numPr>
+        <w:spacing w:after="60" w:line="264"/>
+      </w:pPr>
+      <w:r>
+        <w:rPr>
+          <w:b/>
+          <w:bCs/>
+          <w:color w:val="1F2430"/>
+          <w:sz w:val="21"/>
+          <w:szCs w:val="21"/>
+        </w:rPr>
+        <w:t xml:space="preserve">ST.18.3 Console Operation and ST.18.8 Live Event Execution: </w:t>
+      </w:r>
+      <w:r>
+        <w:rPr>
+          <w:color w:val="1F2430"/>
+          <w:sz w:val="21"/>
+          <w:szCs w:val="21"/>
+        </w:rPr>
+        <w:t xml:space="preserve">“real-time adjustments (e.g., levels, timing)” while “following cues … and managing show flow” — the game loop is literally these two standards at performance tempo.</w:t>
+      </w:r>
+    </w:p>
+    <w:p>
+      <w:pPr>
+        <w:spacing w:after="60" w:before="160"/>
+      </w:pPr>
+      <w:r>
+        <w:rPr>
+          <w:b/>
+          <w:bCs/>
+          <w:color w:val="6B7280"/>
+          <w:sz w:val="18"/>
+          <w:szCs w:val="18"/>
+        </w:rPr>
         <w:t xml:space="preserve">CLASSROOM IDEAS</w:t>
       </w:r>
     </w:p>
@@ -5238,6 +5976,49 @@
           <w:sz w:val="18"/>
           <w:szCs w:val="18"/>
         </w:rPr>
+        <w:t xml:space="preserve">STANDARDS CONNECTIONS</w:t>
+      </w:r>
+    </w:p>
+    <w:p>
+      <w:pPr>
+        <w:pStyle w:val="ListParagraph"/>
+        <w:numPr>
+          <w:ilvl w:val="0"/>
+          <w:numId w:val="2"/>
+        </w:numPr>
+        <w:spacing w:after="60" w:line="264"/>
+      </w:pPr>
+      <w:r>
+        <w:rPr>
+          <w:b/>
+          <w:bCs/>
+          <w:color w:val="1F2430"/>
+          <w:sz w:val="21"/>
+          <w:szCs w:val="21"/>
+        </w:rPr>
+        <w:t xml:space="preserve">ST.17.3 Costumes &amp; Makeup Design: </w:t>
+      </w:r>
+      <w:r>
+        <w:rPr>
+          <w:color w:val="1F2430"/>
+          <w:sz w:val="21"/>
+          <w:szCs w:val="21"/>
+        </w:rPr>
+        <w:t xml:space="preserve">“design, source, and assemble costumes … that reflect aesthetic and cultural context … support storytelling, define character, and engage audiences.” The eight briefs check period accuracy and character logic against exactly these criteria, and the reflection prompts make students argue the storytelling case.</w:t>
+      </w:r>
+    </w:p>
+    <w:p>
+      <w:pPr>
+        <w:spacing w:after="60" w:before="160"/>
+      </w:pPr>
+      <w:r>
+        <w:rPr>
+          <w:b/>
+          <w:bCs/>
+          <w:color w:val="6B7280"/>
+          <w:sz w:val="18"/>
+          <w:szCs w:val="18"/>
+        </w:rPr>
         <w:t xml:space="preserve">CLASSROOM IDEAS</w:t>
       </w:r>
     </w:p>
@@ -5461,7 +6242,7 @@
           <w:sz w:val="21"/>
           <w:szCs w:val="21"/>
         </w:rPr>
-        <w:t xml:space="preserve">Gate real equipment on the virtual version: the construction quiz before shop tools, the Live Sound certificate before the rig, a line-mixing accuracy bar before A1 assignments.</w:t>
+        <w:t xml:space="preserve">Gate real equipment on the virtual version: the construction quiz before shop tools, the Live Sound certificate before the rig, a line-mixing accuracy bar before A1 assignments. It is also a defensible record that students practiced console operation (ST.18.3) and rehearsal workflow (ST.18.6) before touching production-critical gear.</w:t>
       </w:r>
     </w:p>
     <w:p>
@@ -6473,7 +7254,7 @@
           <w:sz w:val="21"/>
           <w:szCs w:val="21"/>
         </w:rPr>
-        <w:t xml:space="preserve">Sound Cue Lab on the actual show’s cues; Line Mixing for the musical’s mix team.</w:t>
+        <w:t xml:space="preserve">Sound Cue Lab on the actual show’s cues; Line Mixing for the musical’s mix team. This is the stage-and-event core of the standards in production context: rehearsal workflow (ST.18.6), live event execution (ST.18.8), and the stage manager’s cue-calling ecosystem the operators plug into (ST.18.5).</w:t>
       </w:r>
     </w:p>
     <w:p>
@@ -7161,6 +7942,704 @@
     </w:tbl>
     <w:p>
       <w:pPr>
+        <w:spacing w:after="60" w:before="160"/>
+      </w:pPr>
+      <w:r>
+        <w:rPr>
+          <w:b/>
+          <w:bCs/>
+          <w:color w:val="6B7280"/>
+          <w:sz w:val="18"/>
+          <w:szCs w:val="18"/>
+        </w:rPr>
+        <w:t xml:space="preserve">STANDARDS MAP — CA CTE, STAGE &amp; EVENT TECHNOLOGY</w:t>
+      </w:r>
+    </w:p>
+    <w:p>
+      <w:pPr>
+        <w:spacing w:after="120" w:line="264"/>
+      </w:pPr>
+      <w:r>
+        <w:rPr>
+          <w:color w:val="1F2430"/>
+          <w:sz w:val="21"/>
+          <w:szCs w:val="21"/>
+        </w:rPr>
+        <w:t xml:space="preserve">For syllabi, course outlines, and CTE program review, the table below maps each lab to the Stage &amp; Event Technology standards it most directly serves (California CTE Model Curriculum Standards, Arts, Entertainment &amp; Design career cluster; Performance, Music, &amp; Live Entertainment pathway). The per-lab sections above quote the relevant standard language.</w:t>
+      </w:r>
+    </w:p>
+    <w:tbl>
+      <w:tblPr>
+        <w:tblW w:type="dxa" w:w="9936"/>
+        <w:tblBorders>
+          <w:top w:val="single" w:color="auto" w:sz="4"/>
+          <w:left w:val="single" w:color="auto" w:sz="4"/>
+          <w:bottom w:val="single" w:color="auto" w:sz="4"/>
+          <w:right w:val="single" w:color="auto" w:sz="4"/>
+          <w:insideH w:val="single" w:color="auto" w:sz="4"/>
+          <w:insideV w:val="single" w:color="auto" w:sz="4"/>
+        </w:tblBorders>
+      </w:tblPr>
+      <w:tblGrid>
+        <w:gridCol w:w="2400"/>
+        <w:gridCol w:w="7536"/>
+      </w:tblGrid>
+      <w:tr>
+        <w:trPr>
+          <w:tblHeader/>
+        </w:trPr>
+        <w:tc>
+          <w:tcPr>
+            <w:tcW w:type="dxa" w:w="2400"/>
+            <w:shd w:fill="EFEFEF" w:val="clear"/>
+            <w:tcMar>
+              <w:top w:type="dxa" w:w="70"/>
+              <w:left w:type="dxa" w:w="100"/>
+              <w:bottom w:type="dxa" w:w="70"/>
+              <w:right w:type="dxa" w:w="100"/>
+            </w:tcMar>
+          </w:tcPr>
+          <w:p>
+            <w:pPr>
+              <w:spacing w:after="20" w:line="252"/>
+            </w:pPr>
+            <w:r>
+              <w:rPr>
+                <w:b/>
+                <w:bCs/>
+                <w:color w:val="333333"/>
+                <w:sz w:val="19"/>
+                <w:szCs w:val="19"/>
+              </w:rPr>
+              <w:t xml:space="preserve">Lab</w:t>
+            </w:r>
+          </w:p>
+        </w:tc>
+        <w:tc>
+          <w:tcPr>
+            <w:tcW w:type="dxa" w:w="7536"/>
+            <w:shd w:fill="EFEFEF" w:val="clear"/>
+            <w:tcMar>
+              <w:top w:type="dxa" w:w="70"/>
+              <w:left w:type="dxa" w:w="100"/>
+              <w:bottom w:type="dxa" w:w="70"/>
+              <w:right w:type="dxa" w:w="100"/>
+            </w:tcMar>
+          </w:tcPr>
+          <w:p>
+            <w:pPr>
+              <w:spacing w:after="20" w:line="252"/>
+            </w:pPr>
+            <w:r>
+              <w:rPr>
+                <w:b/>
+                <w:bCs/>
+                <w:color w:val="333333"/>
+                <w:sz w:val="19"/>
+                <w:szCs w:val="19"/>
+              </w:rPr>
+              <w:t xml:space="preserve">Stage &amp; Event Technology standards addressed</w:t>
+            </w:r>
+          </w:p>
+        </w:tc>
+      </w:tr>
+      <w:tr>
+        <w:tc>
+          <w:tcPr>
+            <w:tcW w:type="dxa" w:w="2400"/>
+            <w:tcMar>
+              <w:top w:type="dxa" w:w="70"/>
+              <w:left w:type="dxa" w:w="100"/>
+              <w:bottom w:type="dxa" w:w="70"/>
+              <w:right w:type="dxa" w:w="100"/>
+            </w:tcMar>
+          </w:tcPr>
+          <w:p>
+            <w:pPr>
+              <w:spacing w:after="20" w:line="252"/>
+            </w:pPr>
+            <w:r>
+              <w:rPr>
+                <w:b w:val="false"/>
+                <w:bCs w:val="false"/>
+                <w:color w:val="1F2430"/>
+                <w:sz w:val="19"/>
+                <w:szCs w:val="19"/>
+              </w:rPr>
+              <w:t xml:space="preserve">Scenic Construction</w:t>
+            </w:r>
+          </w:p>
+        </w:tc>
+        <w:tc>
+          <w:tcPr>
+            <w:tcW w:type="dxa" w:w="7536"/>
+            <w:tcMar>
+              <w:top w:type="dxa" w:w="70"/>
+              <w:left w:type="dxa" w:w="100"/>
+              <w:bottom w:type="dxa" w:w="70"/>
+              <w:right w:type="dxa" w:w="100"/>
+            </w:tcMar>
+          </w:tcPr>
+          <w:p>
+            <w:pPr>
+              <w:spacing w:after="20" w:line="252"/>
+            </w:pPr>
+            <w:r>
+              <w:rPr>
+                <w:b w:val="false"/>
+                <w:bCs w:val="false"/>
+                <w:color w:val="1F2430"/>
+                <w:sz w:val="19"/>
+                <w:szCs w:val="19"/>
+              </w:rPr>
+              <w:t xml:space="preserve">ST.17.4 Scenic &amp; Props · ST.18.1 Reading Technical Drawings</w:t>
+            </w:r>
+          </w:p>
+        </w:tc>
+      </w:tr>
+      <w:tr>
+        <w:tc>
+          <w:tcPr>
+            <w:tcW w:type="dxa" w:w="2400"/>
+            <w:tcMar>
+              <w:top w:type="dxa" w:w="70"/>
+              <w:left w:type="dxa" w:w="100"/>
+              <w:bottom w:type="dxa" w:w="70"/>
+              <w:right w:type="dxa" w:w="100"/>
+            </w:tcMar>
+          </w:tcPr>
+          <w:p>
+            <w:pPr>
+              <w:spacing w:after="20" w:line="252"/>
+            </w:pPr>
+            <w:r>
+              <w:rPr>
+                <w:b w:val="false"/>
+                <w:bCs w:val="false"/>
+                <w:color w:val="1F2430"/>
+                <w:sz w:val="19"/>
+                <w:szCs w:val="19"/>
+              </w:rPr>
+              <w:t xml:space="preserve">Drafting</w:t>
+            </w:r>
+          </w:p>
+        </w:tc>
+        <w:tc>
+          <w:tcPr>
+            <w:tcW w:type="dxa" w:w="7536"/>
+            <w:tcMar>
+              <w:top w:type="dxa" w:w="70"/>
+              <w:left w:type="dxa" w:w="100"/>
+              <w:bottom w:type="dxa" w:w="70"/>
+              <w:right w:type="dxa" w:w="100"/>
+            </w:tcMar>
+          </w:tcPr>
+          <w:p>
+            <w:pPr>
+              <w:spacing w:after="20" w:line="252"/>
+            </w:pPr>
+            <w:r>
+              <w:rPr>
+                <w:b w:val="false"/>
+                <w:bCs w:val="false"/>
+                <w:color w:val="1F2430"/>
+                <w:sz w:val="19"/>
+                <w:szCs w:val="19"/>
+              </w:rPr>
+              <w:t xml:space="preserve">ST.18.1 Reading Technical Drawings · ST.18.2 Event Design Software Tools</w:t>
+            </w:r>
+          </w:p>
+        </w:tc>
+      </w:tr>
+      <w:tr>
+        <w:tc>
+          <w:tcPr>
+            <w:tcW w:type="dxa" w:w="2400"/>
+            <w:tcMar>
+              <w:top w:type="dxa" w:w="70"/>
+              <w:left w:type="dxa" w:w="100"/>
+              <w:bottom w:type="dxa" w:w="70"/>
+              <w:right w:type="dxa" w:w="100"/>
+            </w:tcMar>
+          </w:tcPr>
+          <w:p>
+            <w:pPr>
+              <w:spacing w:after="20" w:line="252"/>
+            </w:pPr>
+            <w:r>
+              <w:rPr>
+                <w:b w:val="false"/>
+                <w:bCs w:val="false"/>
+                <w:color w:val="1F2430"/>
+                <w:sz w:val="19"/>
+                <w:szCs w:val="19"/>
+              </w:rPr>
+              <w:t xml:space="preserve">Scenic Design</w:t>
+            </w:r>
+          </w:p>
+        </w:tc>
+        <w:tc>
+          <w:tcPr>
+            <w:tcW w:type="dxa" w:w="7536"/>
+            <w:tcMar>
+              <w:top w:type="dxa" w:w="70"/>
+              <w:left w:type="dxa" w:w="100"/>
+              <w:bottom w:type="dxa" w:w="70"/>
+              <w:right w:type="dxa" w:w="100"/>
+            </w:tcMar>
+          </w:tcPr>
+          <w:p>
+            <w:pPr>
+              <w:spacing w:after="20" w:line="252"/>
+            </w:pPr>
+            <w:r>
+              <w:rPr>
+                <w:b w:val="false"/>
+                <w:bCs w:val="false"/>
+                <w:color w:val="1F2430"/>
+                <w:sz w:val="19"/>
+                <w:szCs w:val="19"/>
+              </w:rPr>
+              <w:t xml:space="preserve">ST.17.1 Production Design Fundamentals · ST.18.2 Event Design Software Tools · ST.18.4 Design &amp; Test</w:t>
+            </w:r>
+          </w:p>
+        </w:tc>
+      </w:tr>
+      <w:tr>
+        <w:tc>
+          <w:tcPr>
+            <w:tcW w:type="dxa" w:w="2400"/>
+            <w:tcMar>
+              <w:top w:type="dxa" w:w="70"/>
+              <w:left w:type="dxa" w:w="100"/>
+              <w:bottom w:type="dxa" w:w="70"/>
+              <w:right w:type="dxa" w:w="100"/>
+            </w:tcMar>
+          </w:tcPr>
+          <w:p>
+            <w:pPr>
+              <w:spacing w:after="20" w:line="252"/>
+            </w:pPr>
+            <w:r>
+              <w:rPr>
+                <w:b w:val="false"/>
+                <w:bCs w:val="false"/>
+                <w:color w:val="1F2430"/>
+                <w:sz w:val="19"/>
+                <w:szCs w:val="19"/>
+              </w:rPr>
+              <w:t xml:space="preserve">Lighting Design</w:t>
+            </w:r>
+          </w:p>
+        </w:tc>
+        <w:tc>
+          <w:tcPr>
+            <w:tcW w:type="dxa" w:w="7536"/>
+            <w:tcMar>
+              <w:top w:type="dxa" w:w="70"/>
+              <w:left w:type="dxa" w:w="100"/>
+              <w:bottom w:type="dxa" w:w="70"/>
+              <w:right w:type="dxa" w:w="100"/>
+            </w:tcMar>
+          </w:tcPr>
+          <w:p>
+            <w:pPr>
+              <w:spacing w:after="20" w:line="252"/>
+            </w:pPr>
+            <w:r>
+              <w:rPr>
+                <w:b w:val="false"/>
+                <w:bCs w:val="false"/>
+                <w:color w:val="1F2430"/>
+                <w:sz w:val="19"/>
+                <w:szCs w:val="19"/>
+              </w:rPr>
+              <w:t xml:space="preserve">ST.17.7 Lighting · ST.18.3 Console Operation</w:t>
+            </w:r>
+          </w:p>
+        </w:tc>
+      </w:tr>
+      <w:tr>
+        <w:tc>
+          <w:tcPr>
+            <w:tcW w:type="dxa" w:w="2400"/>
+            <w:tcMar>
+              <w:top w:type="dxa" w:w="70"/>
+              <w:left w:type="dxa" w:w="100"/>
+              <w:bottom w:type="dxa" w:w="70"/>
+              <w:right w:type="dxa" w:w="100"/>
+            </w:tcMar>
+          </w:tcPr>
+          <w:p>
+            <w:pPr>
+              <w:spacing w:after="20" w:line="252"/>
+            </w:pPr>
+            <w:r>
+              <w:rPr>
+                <w:b w:val="false"/>
+                <w:bCs w:val="false"/>
+                <w:color w:val="1F2430"/>
+                <w:sz w:val="19"/>
+                <w:szCs w:val="19"/>
+              </w:rPr>
+              <w:t xml:space="preserve">Portrait Lighting</w:t>
+            </w:r>
+          </w:p>
+        </w:tc>
+        <w:tc>
+          <w:tcPr>
+            <w:tcW w:type="dxa" w:w="7536"/>
+            <w:tcMar>
+              <w:top w:type="dxa" w:w="70"/>
+              <w:left w:type="dxa" w:w="100"/>
+              <w:bottom w:type="dxa" w:w="70"/>
+              <w:right w:type="dxa" w:w="100"/>
+            </w:tcMar>
+          </w:tcPr>
+          <w:p>
+            <w:pPr>
+              <w:spacing w:after="20" w:line="252"/>
+            </w:pPr>
+            <w:r>
+              <w:rPr>
+                <w:b w:val="false"/>
+                <w:bCs w:val="false"/>
+                <w:color w:val="1F2430"/>
+                <w:sz w:val="19"/>
+                <w:szCs w:val="19"/>
+              </w:rPr>
+              <w:t xml:space="preserve">ST.17.7 Lighting · ST.18.4 Design &amp; Test</w:t>
+            </w:r>
+          </w:p>
+        </w:tc>
+      </w:tr>
+      <w:tr>
+        <w:tc>
+          <w:tcPr>
+            <w:tcW w:type="dxa" w:w="2400"/>
+            <w:tcMar>
+              <w:top w:type="dxa" w:w="70"/>
+              <w:left w:type="dxa" w:w="100"/>
+              <w:bottom w:type="dxa" w:w="70"/>
+              <w:right w:type="dxa" w:w="100"/>
+            </w:tcMar>
+          </w:tcPr>
+          <w:p>
+            <w:pPr>
+              <w:spacing w:after="20" w:line="252"/>
+            </w:pPr>
+            <w:r>
+              <w:rPr>
+                <w:b w:val="false"/>
+                <w:bCs w:val="false"/>
+                <w:color w:val="1F2430"/>
+                <w:sz w:val="19"/>
+                <w:szCs w:val="19"/>
+              </w:rPr>
+              <w:t xml:space="preserve">Studio Lighting</w:t>
+            </w:r>
+          </w:p>
+        </w:tc>
+        <w:tc>
+          <w:tcPr>
+            <w:tcW w:type="dxa" w:w="7536"/>
+            <w:tcMar>
+              <w:top w:type="dxa" w:w="70"/>
+              <w:left w:type="dxa" w:w="100"/>
+              <w:bottom w:type="dxa" w:w="70"/>
+              <w:right w:type="dxa" w:w="100"/>
+            </w:tcMar>
+          </w:tcPr>
+          <w:p>
+            <w:pPr>
+              <w:spacing w:after="20" w:line="252"/>
+            </w:pPr>
+            <w:r>
+              <w:rPr>
+                <w:b w:val="false"/>
+                <w:bCs w:val="false"/>
+                <w:color w:val="1F2430"/>
+                <w:sz w:val="19"/>
+                <w:szCs w:val="19"/>
+              </w:rPr>
+              <w:t xml:space="preserve">ST.17.1 Production Design Fundamentals · ST.17.7 Lighting</w:t>
+            </w:r>
+          </w:p>
+        </w:tc>
+      </w:tr>
+      <w:tr>
+        <w:tc>
+          <w:tcPr>
+            <w:tcW w:type="dxa" w:w="2400"/>
+            <w:tcMar>
+              <w:top w:type="dxa" w:w="70"/>
+              <w:left w:type="dxa" w:w="100"/>
+              <w:bottom w:type="dxa" w:w="70"/>
+              <w:right w:type="dxa" w:w="100"/>
+            </w:tcMar>
+          </w:tcPr>
+          <w:p>
+            <w:pPr>
+              <w:spacing w:after="20" w:line="252"/>
+            </w:pPr>
+            <w:r>
+              <w:rPr>
+                <w:b w:val="false"/>
+                <w:bCs w:val="false"/>
+                <w:color w:val="1F2430"/>
+                <w:sz w:val="19"/>
+                <w:szCs w:val="19"/>
+              </w:rPr>
+              <w:t xml:space="preserve">Live Sound</w:t>
+            </w:r>
+          </w:p>
+        </w:tc>
+        <w:tc>
+          <w:tcPr>
+            <w:tcW w:type="dxa" w:w="7536"/>
+            <w:tcMar>
+              <w:top w:type="dxa" w:w="70"/>
+              <w:left w:type="dxa" w:w="100"/>
+              <w:bottom w:type="dxa" w:w="70"/>
+              <w:right w:type="dxa" w:w="100"/>
+            </w:tcMar>
+          </w:tcPr>
+          <w:p>
+            <w:pPr>
+              <w:spacing w:after="20" w:line="252"/>
+            </w:pPr>
+            <w:r>
+              <w:rPr>
+                <w:b w:val="false"/>
+                <w:bCs w:val="false"/>
+                <w:color w:val="1F2430"/>
+                <w:sz w:val="19"/>
+                <w:szCs w:val="19"/>
+              </w:rPr>
+              <w:t xml:space="preserve">ST.17.5 Power &amp; Data Systems · ST.17.8 Audio · ST.18.7 Live Equipment Troubleshooting</w:t>
+            </w:r>
+          </w:p>
+        </w:tc>
+      </w:tr>
+      <w:tr>
+        <w:tc>
+          <w:tcPr>
+            <w:tcW w:type="dxa" w:w="2400"/>
+            <w:tcMar>
+              <w:top w:type="dxa" w:w="70"/>
+              <w:left w:type="dxa" w:w="100"/>
+              <w:bottom w:type="dxa" w:w="70"/>
+              <w:right w:type="dxa" w:w="100"/>
+            </w:tcMar>
+          </w:tcPr>
+          <w:p>
+            <w:pPr>
+              <w:spacing w:after="20" w:line="252"/>
+            </w:pPr>
+            <w:r>
+              <w:rPr>
+                <w:b w:val="false"/>
+                <w:bCs w:val="false"/>
+                <w:color w:val="1F2430"/>
+                <w:sz w:val="19"/>
+                <w:szCs w:val="19"/>
+              </w:rPr>
+              <w:t xml:space="preserve">Sound Cue</w:t>
+            </w:r>
+          </w:p>
+        </w:tc>
+        <w:tc>
+          <w:tcPr>
+            <w:tcW w:type="dxa" w:w="7536"/>
+            <w:tcMar>
+              <w:top w:type="dxa" w:w="70"/>
+              <w:left w:type="dxa" w:w="100"/>
+              <w:bottom w:type="dxa" w:w="70"/>
+              <w:right w:type="dxa" w:w="100"/>
+            </w:tcMar>
+          </w:tcPr>
+          <w:p>
+            <w:pPr>
+              <w:spacing w:after="20" w:line="252"/>
+            </w:pPr>
+            <w:r>
+              <w:rPr>
+                <w:b w:val="false"/>
+                <w:bCs w:val="false"/>
+                <w:color w:val="1F2430"/>
+                <w:sz w:val="19"/>
+                <w:szCs w:val="19"/>
+              </w:rPr>
+              <w:t xml:space="preserve">ST.18.2 Event Design Software Tools · ST.18.3 Console Operation · ST.18.8 Live Event Execution</w:t>
+            </w:r>
+          </w:p>
+        </w:tc>
+      </w:tr>
+      <w:tr>
+        <w:tc>
+          <w:tcPr>
+            <w:tcW w:type="dxa" w:w="2400"/>
+            <w:tcMar>
+              <w:top w:type="dxa" w:w="70"/>
+              <w:left w:type="dxa" w:w="100"/>
+              <w:bottom w:type="dxa" w:w="70"/>
+              <w:right w:type="dxa" w:w="100"/>
+            </w:tcMar>
+          </w:tcPr>
+          <w:p>
+            <w:pPr>
+              <w:spacing w:after="20" w:line="252"/>
+            </w:pPr>
+            <w:r>
+              <w:rPr>
+                <w:b w:val="false"/>
+                <w:bCs w:val="false"/>
+                <w:color w:val="1F2430"/>
+                <w:sz w:val="19"/>
+                <w:szCs w:val="19"/>
+              </w:rPr>
+              <w:t xml:space="preserve">Line Mixing</w:t>
+            </w:r>
+          </w:p>
+        </w:tc>
+        <w:tc>
+          <w:tcPr>
+            <w:tcW w:type="dxa" w:w="7536"/>
+            <w:tcMar>
+              <w:top w:type="dxa" w:w="70"/>
+              <w:left w:type="dxa" w:w="100"/>
+              <w:bottom w:type="dxa" w:w="70"/>
+              <w:right w:type="dxa" w:w="100"/>
+            </w:tcMar>
+          </w:tcPr>
+          <w:p>
+            <w:pPr>
+              <w:spacing w:after="20" w:line="252"/>
+            </w:pPr>
+            <w:r>
+              <w:rPr>
+                <w:b w:val="false"/>
+                <w:bCs w:val="false"/>
+                <w:color w:val="1F2430"/>
+                <w:sz w:val="19"/>
+                <w:szCs w:val="19"/>
+              </w:rPr>
+              <w:t xml:space="preserve">ST.17.8 Audio · ST.18.3 Console Operation · ST.18.8 Live Event Execution</w:t>
+            </w:r>
+          </w:p>
+        </w:tc>
+      </w:tr>
+      <w:tr>
+        <w:tc>
+          <w:tcPr>
+            <w:tcW w:type="dxa" w:w="2400"/>
+            <w:tcMar>
+              <w:top w:type="dxa" w:w="70"/>
+              <w:left w:type="dxa" w:w="100"/>
+              <w:bottom w:type="dxa" w:w="70"/>
+              <w:right w:type="dxa" w:w="100"/>
+            </w:tcMar>
+          </w:tcPr>
+          <w:p>
+            <w:pPr>
+              <w:spacing w:after="20" w:line="252"/>
+            </w:pPr>
+            <w:r>
+              <w:rPr>
+                <w:b w:val="false"/>
+                <w:bCs w:val="false"/>
+                <w:color w:val="1F2430"/>
+                <w:sz w:val="19"/>
+                <w:szCs w:val="19"/>
+              </w:rPr>
+              <w:t xml:space="preserve">Costume Design</w:t>
+            </w:r>
+          </w:p>
+        </w:tc>
+        <w:tc>
+          <w:tcPr>
+            <w:tcW w:type="dxa" w:w="7536"/>
+            <w:tcMar>
+              <w:top w:type="dxa" w:w="70"/>
+              <w:left w:type="dxa" w:w="100"/>
+              <w:bottom w:type="dxa" w:w="70"/>
+              <w:right w:type="dxa" w:w="100"/>
+            </w:tcMar>
+          </w:tcPr>
+          <w:p>
+            <w:pPr>
+              <w:spacing w:after="20" w:line="252"/>
+            </w:pPr>
+            <w:r>
+              <w:rPr>
+                <w:b w:val="false"/>
+                <w:bCs w:val="false"/>
+                <w:color w:val="1F2430"/>
+                <w:sz w:val="19"/>
+                <w:szCs w:val="19"/>
+              </w:rPr>
+              <w:t xml:space="preserve">ST.17.3 Costumes &amp; Makeup Design</w:t>
+            </w:r>
+          </w:p>
+        </w:tc>
+      </w:tr>
+      <w:tr>
+        <w:tc>
+          <w:tcPr>
+            <w:tcW w:type="dxa" w:w="2400"/>
+            <w:tcMar>
+              <w:top w:type="dxa" w:w="70"/>
+              <w:left w:type="dxa" w:w="100"/>
+              <w:bottom w:type="dxa" w:w="70"/>
+              <w:right w:type="dxa" w:w="100"/>
+            </w:tcMar>
+          </w:tcPr>
+          <w:p>
+            <w:pPr>
+              <w:spacing w:after="20" w:line="252"/>
+            </w:pPr>
+            <w:r>
+              <w:rPr>
+                <w:b w:val="false"/>
+                <w:bCs w:val="false"/>
+                <w:color w:val="1F2430"/>
+                <w:sz w:val="19"/>
+                <w:szCs w:val="19"/>
+              </w:rPr>
+              <w:t xml:space="preserve">All ten together</w:t>
+            </w:r>
+          </w:p>
+        </w:tc>
+        <w:tc>
+          <w:tcPr>
+            <w:tcW w:type="dxa" w:w="7536"/>
+            <w:tcMar>
+              <w:top w:type="dxa" w:w="70"/>
+              <w:left w:type="dxa" w:w="100"/>
+              <w:bottom w:type="dxa" w:w="70"/>
+              <w:right w:type="dxa" w:w="100"/>
+            </w:tcMar>
+          </w:tcPr>
+          <w:p>
+            <w:pPr>
+              <w:spacing w:after="20" w:line="252"/>
+            </w:pPr>
+            <w:r>
+              <w:rPr>
+                <w:b w:val="false"/>
+                <w:bCs w:val="false"/>
+                <w:color w:val="1F2430"/>
+                <w:sz w:val="19"/>
+                <w:szCs w:val="19"/>
+              </w:rPr>
+              <w:t xml:space="preserve">ST.19.2 Production Technology and ST.19.3 Creative Direction — rotating through the hub is a hands-on career survey of the production crafts, trades, and design roles</w:t>
+            </w:r>
+          </w:p>
+        </w:tc>
+      </w:tr>
+    </w:tbl>
+    <w:p>
+      <w:pPr>
         <w:spacing w:after="120" w:line="264"/>
       </w:pPr>
       <w:r>
@@ -7171,7 +8650,7 @@
           <w:sz w:val="21"/>
           <w:szCs w:val="21"/>
         </w:rPr>
-        <w:t xml:space="preserve">The labs’ activities sit comfortably under the National Core Arts Standards for Theatre (developing and realizing technical elements of design) and Media Arts (production skills), and support Arts, Media &amp; Entertainment CTE pathway outcomes — map the specific codes to your local framework as needed.</w:t>
+        <w:t xml:space="preserve">Beyond the pathway standards, every lab exercises the cluster’s Career Ready and Cross-Pathway expectations — collaboration, technical literacy, and safe work practices — and the design labs also sit comfortably under the National Core Arts Standards for Theatre (developing and realizing technical elements of design) if your course maps to arts credit rather than CTE.</w:t>
       </w:r>
     </w:p>
     <w:p>
@@ -7213,6 +8692,21 @@
     </w:p>
     <w:p>
       <w:pPr>
+        <w:spacing w:after="120" w:line="264"/>
+      </w:pPr>
+      <w:r>
+        <w:rPr>
+          <w:i/>
+          <w:iCs/>
+          <w:color w:val="6B7280"/>
+          <w:sz w:val="21"/>
+          <w:szCs w:val="21"/>
+        </w:rPr>
+        <w:t xml:space="preserve">CTE note: film and photography courses map primarily to the Media Production pathway of the same standards document. The citations below deliberately stay within the Stage &amp; Event Technology focus area, whose lighting (ST.17.7), audio (ST.17.8), and console (ST.18.3) skill-building standards apply wherever those crafts are taught.</w:t>
+      </w:r>
+    </w:p>
+    <w:p>
+      <w:pPr>
         <w:spacing w:after="60" w:before="160"/>
       </w:pPr>
       <w:r>
@@ -7322,7 +8816,7 @@
           <w:sz w:val="21"/>
           <w:szCs w:val="21"/>
         </w:rPr>
-        <w:t xml:space="preserve">the three-point interview setup, plus genre looks — noir edge and golden hour map straight onto film-language units. Require a shot plan as a pre-production deliverable.</w:t>
+        <w:t xml:space="preserve">the three-point interview setup, plus genre looks — noir edge and golden hour map straight onto film-language units. Require a shot plan as a pre-production deliverable (ST.17.7; ST.17.1).</w:t>
       </w:r>
     </w:p>
     <w:p>
@@ -7350,7 +8844,7 @@
           <w:sz w:val="21"/>
           <w:szCs w:val="21"/>
         </w:rPr>
-        <w:t xml:space="preserve">design the sound bed for a short film scene, radio play, or podcast episode; the standalone export plays anywhere, so critique day needs no special software.</w:t>
+        <w:t xml:space="preserve">design the sound bed for a short film scene, radio play, or podcast episode; the standalone export plays anywhere, so critique day needs no special software (ST.18.3; ST.18.8).</w:t>
       </w:r>
     </w:p>
     <w:p>

</xml_diff>